<commit_message>
updated chapters and images
</commit_message>
<xml_diff>
--- a/content/docx/chapter-one.docx
+++ b/content/docx/chapter-one.docx
@@ -1,6 +1,6 @@
 
 <file path=word/document.xml><?xml version="1.0" encoding="utf-8"?>
-<w:document xmlns:wpc="http://schemas.microsoft.com/office/word/2010/wordprocessingCanvas" xmlns:cx="http://schemas.microsoft.com/office/drawing/2014/chartex" xmlns:cx1="http://schemas.microsoft.com/office/drawing/2015/9/8/chartex" xmlns:cx2="http://schemas.microsoft.com/office/drawing/2015/10/21/chartex" xmlns:cx3="http://schemas.microsoft.com/office/drawing/2016/5/9/chartex" xmlns:cx4="http://schemas.microsoft.com/office/drawing/2016/5/10/chartex" xmlns:cx5="http://schemas.microsoft.com/office/drawing/2016/5/11/chartex" xmlns:cx6="http://schemas.microsoft.com/office/drawing/2016/5/12/chartex" xmlns:cx7="http://schemas.microsoft.com/office/drawing/2016/5/13/chartex" xmlns:cx8="http://schemas.microsoft.com/office/drawing/2016/5/14/chartex" xmlns:mc="http://schemas.openxmlformats.org/markup-compatibility/2006" xmlns:aink="http://schemas.microsoft.com/office/drawing/2016/ink" xmlns:am3d="http://schemas.microsoft.com/office/drawing/2017/model3d" xmlns:o="urn:schemas-microsoft-com:office:office" xmlns:oel="http://schemas.microsoft.com/office/2019/extlst" xmlns:r="http://schemas.openxmlformats.org/officeDocument/2006/relationships" xmlns:m="http://schemas.openxmlformats.org/officeDocument/2006/math" xmlns:v="urn:schemas-microsoft-com:vml" xmlns:wp14="http://schemas.microsoft.com/office/word/2010/wordprocessingDrawing" xmlns:wp="http://schemas.openxmlformats.org/drawingml/2006/wordprocessingDrawing" xmlns:w10="urn:schemas-microsoft-com:office:word" xmlns:w="http://schemas.openxmlformats.org/wordprocessingml/2006/main" xmlns:w14="http://schemas.microsoft.com/office/word/2010/wordml" xmlns:w15="http://schemas.microsoft.com/office/word/2012/wordml" xmlns:w16cex="http://schemas.microsoft.com/office/word/2018/wordml/cex" xmlns:w16cid="http://schemas.microsoft.com/office/word/2016/wordml/cid" xmlns:w16="http://schemas.microsoft.com/office/word/2018/wordml" xmlns:w16du="http://schemas.microsoft.com/office/word/2023/wordml/word16du" xmlns:w16sdtdh="http://schemas.microsoft.com/office/word/2020/wordml/sdtdatahash" xmlns:w16sdtfl="http://schemas.microsoft.com/office/word/2024/wordml/sdtformatlock" xmlns:w16se="http://schemas.microsoft.com/office/word/2015/wordml/symex" xmlns:wpg="http://schemas.microsoft.com/office/word/2010/wordprocessingGroup" xmlns:wpi="http://schemas.microsoft.com/office/word/2010/wordprocessingInk" xmlns:wne="http://schemas.microsoft.com/office/word/2006/wordml" xmlns:wps="http://schemas.microsoft.com/office/word/2010/wordprocessingShape" mc:Ignorable="w14 w15 w16se w16cid w16 w16cex w16sdtdh w16sdtfl w16du wp14">
+<w:document xmlns:wpc="http://schemas.microsoft.com/office/word/2010/wordprocessingCanvas" xmlns:cx="http://schemas.microsoft.com/office/drawing/2014/chartex" xmlns:cx1="http://schemas.microsoft.com/office/drawing/2015/9/8/chartex" xmlns:cx2="http://schemas.microsoft.com/office/drawing/2015/10/21/chartex" xmlns:cx3="http://schemas.microsoft.com/office/drawing/2016/5/9/chartex" xmlns:cx4="http://schemas.microsoft.com/office/drawing/2016/5/10/chartex" xmlns:cx5="http://schemas.microsoft.com/office/drawing/2016/5/11/chartex" xmlns:cx6="http://schemas.microsoft.com/office/drawing/2016/5/12/chartex" xmlns:cx7="http://schemas.microsoft.com/office/drawing/2016/5/13/chartex" xmlns:cx8="http://schemas.microsoft.com/office/drawing/2016/5/14/chartex" xmlns:mc="http://schemas.openxmlformats.org/markup-compatibility/2006" xmlns:m="http://schemas.openxmlformats.org/officeDocument/2006/math" xmlns:aink="http://schemas.microsoft.com/office/drawing/2016/ink" xmlns:am3d="http://schemas.microsoft.com/office/drawing/2017/model3d" xmlns:oel="http://schemas.microsoft.com/office/2019/extlst" xmlns:r="http://schemas.openxmlformats.org/officeDocument/2006/relationships" xmlns:wp14="http://schemas.microsoft.com/office/word/2010/wordprocessingDrawing" xmlns:wp="http://schemas.openxmlformats.org/drawingml/2006/wordprocessingDrawing" xmlns:wpg="http://schemas.microsoft.com/office/word/2010/wordprocessingGroup" xmlns:wpi="http://schemas.microsoft.com/office/word/2010/wordprocessingInk" xmlns:wps="http://schemas.microsoft.com/office/word/2010/wordprocessingShape" xmlns:o="urn:schemas-microsoft-com:office:office" xmlns:v="urn:schemas-microsoft-com:vml" xmlns:w10="urn:schemas-microsoft-com:office:word" xmlns:w="http://schemas.openxmlformats.org/wordprocessingml/2006/main" xmlns:w14="http://schemas.microsoft.com/office/word/2010/wordml" xmlns:w15="http://schemas.microsoft.com/office/word/2012/wordml" xmlns:w16cex="http://schemas.microsoft.com/office/word/2018/wordml/cex" xmlns:w16cid="http://schemas.microsoft.com/office/word/2016/wordml/cid" xmlns:w16="http://schemas.microsoft.com/office/word/2018/wordml" xmlns:w16sdtdh="http://schemas.microsoft.com/office/word/2020/wordml/sdtdatahash" xmlns:w16sdtfl="http://schemas.microsoft.com/office/word/2024/wordml/sdtformatlock" xmlns:w16se="http://schemas.microsoft.com/office/word/2015/wordml/symex" xmlns:w16du="http://schemas.microsoft.com/office/word/2023/wordml/word16du" xmlns:wne="http://schemas.microsoft.com/office/word/2006/wordml" mc:Ignorable="w14 w15 w16se w16cid w16 w16cex w16sdtdh w16sdtfl w16du wp14">
   <w:body>
     <w:p>
       <w:pPr>
@@ -27,87 +27,190 @@
         <w:pStyle w:val="T1"/>
       </w:pPr>
       <w:r>
-        <w:t>New Year’s Eve. 2009. Massachusetts Institute of Technology, aka MIT, aka the Institute. Eleven fifty-four pm. I met Nadine on the third-story entrance to a stairwell. She read me the time from her Casio watch, then told me to act quick, said I must find someone to kiss, or my year would just go off the rails. Four flights down, I kissed her at landing. “That’s not what I meant,” she said before kissing me back and pushing my spine into the railing.</w:t>
-      </w:r>
-    </w:p>
-    <w:p>
-      <w:pPr>
-        <w:pStyle w:val="T"/>
-      </w:pPr>
-      <w:r>
-        <w:t xml:space="preserve">I felt certain I was hallucinating her. Having just smoked weed for the first time with a couple of rainbow haired engineers in ill-fitting pants outside East Campus dormitory, everything had a tinge of unreality. Besides she looked too much like me. Give me a few more years, longer hair, heavier thighs, let me loose on bin of punk clothes and vintage watches, and I was kissing myself, hard, and uncomfortably. The hallucination bit my lip before she pulled away. “Prosper,” she said smiling and continuing down the remaining flight of stairs. At the door to the tunnels, she looked up, “You should go outside,” she said. “Get some air. You look high.” </w:t>
-      </w:r>
-    </w:p>
-    <w:p>
-      <w:pPr>
-        <w:pStyle w:val="T"/>
-      </w:pPr>
-      <w:r>
-        <w:t xml:space="preserve">I wiped my mouth with the sleeve of my pink peacoat. A streak of blood provided counterpoint to the hallucination hypothesis. She could be real, I thought. I could be more aware then either of us realized. I opted to follow her into the tunnels, but when I opened the basement door, she wasn’t there. Hello, I yelled. No one answered. </w:t>
-      </w:r>
-    </w:p>
-    <w:p>
-      <w:pPr>
-        <w:pStyle w:val="T1"/>
-      </w:pPr>
-      <w:r>
-        <w:t xml:space="preserve">It had not been my intention to spend New Year’s Eve wandering alone through the Institute. Nine days before my sister and I had arrived at my mother’s new ranch house in Albuquerque. </w:t>
-      </w:r>
-      <w:r>
-        <w:lastRenderedPageBreak/>
-        <w:t>We celebrated family Christmas, then held a memorial for my grandparents, who had passed in quick succession last fall. On the twenty-eighth, I boarded a flight to my hometown, Albany, and settled in for what I intended to be a week with my high school girlfriend. The plan was to recharge by watching independent films before Erin returned to set up a new painting studio at Cooper Union, and I started a winter session research position in a neurobiology lab. But the second night, I snuck into her room after her conservative parents fell asleep and found her, hands in her Hello Kitty pajamas, some blurry dude half naked on Skype, chanting her name. The next morning, I took a bus back to Cambridge and found myself alone in Simmons dormitory.</w:t>
-      </w:r>
-    </w:p>
-    <w:p>
-      <w:pPr>
-        <w:pStyle w:val="T1"/>
-      </w:pPr>
-      <w:r>
-        <w:t xml:space="preserve">Simmons dormitory, aka the Sponge, was designed by Steven Holl as a study of porousness and light. It was a giant rectangular cement grid of small windows broken up by geometric atria which funneled light and air. At the Institute, students were expected to live in a dormitory for the duration of their education, and incoming students typically picked a residence based on warm family like, personality defining subcultures. I picked the Sponge because Holl had designed custom furniture for it: Helsinki-style café tables in the dining room and staggered shelves mounted into lofts with sponge-themed ladders in the bedrooms. </w:t>
-      </w:r>
-    </w:p>
-    <w:p>
-      <w:pPr>
-        <w:pStyle w:val="T"/>
-      </w:pPr>
-      <w:r>
-        <w:t xml:space="preserve">In my single, there was wall was a grid of nine square windows where campus lights bounced off falling snow and prismed against glass panes. Though entirely alone on an industrial campus closed for holiday, for a while at least, I felt sophisticated, leaning back in a smooth and well-crafted wooden chair. I spent the first four hours in that chair reading books and drinking black coffee. I spent the next 20, elegantly dressed in silk purple pajamas, mourning Erin by watching illegally downloaded episodes of Sabrina the Teenage Witch and Buffy the Vampire </w:t>
-      </w:r>
-      <w:r>
-        <w:lastRenderedPageBreak/>
-        <w:t xml:space="preserve">Slayer eating a party sized bag of Sour Patch Kids. The snow accumulated six inches on the windowsill, and by mid-day New Year’s Eve, I was equal parts nauseous and claustrophobic. </w:t>
-      </w:r>
-    </w:p>
-    <w:p>
-      <w:pPr>
-        <w:pStyle w:val="T"/>
-      </w:pPr>
-      <w:r>
-        <w:t xml:space="preserve">I forced myself to shower, dressed even more elegantly in a plaid wool dress, and trudged through fresh snow into Central Square. I ate dinner alone at four o’clock at my favorite Indian buffet, and by the time I paid the check I felt just as sugary, twice as sick, and now also greasy and pathetic for being a college sophomore, in a huge city, alone on New Years Eve. </w:t>
-      </w:r>
-    </w:p>
-    <w:p>
-      <w:pPr>
-        <w:pStyle w:val="T1"/>
-      </w:pPr>
-      <w:r>
-        <w:t>Until I came to MIT, everyone assumed I would be an architect. My father had been one after all, and I spent a lot of time near buildings I thought he would like. Erin’s house, for example, had been built just before the turn of the century. Her parents had restored the façade while we were sophomores, and they let me help. I liked the built environment. But people undervalued the role my naturalist mother played, and that the same year my father died I adopted two cats. Or that I was raised in Albany where the most beautiful architecture, the Empire State Building, was designed explicitly to pave over poverty. A bunch of old Italian family homes had to be obliterated to make way for its fantastical towers and marble reflecting pools.</w:t>
-      </w:r>
-    </w:p>
-    <w:p>
-      <w:pPr>
-        <w:pStyle w:val="T"/>
-      </w:pPr>
-      <w:r>
-        <w:t xml:space="preserve">Whatever the reason, I wasn’t studying architecture. I was majoring in course 12, aka Earth, Atmosphere, and Planetary Sciences, aka EAPS, while also taking coursework to apply to be a vet. I pictured my future like Jane Goodall’s: equal part humans, animals, and environment, certain I would eventually build buildings but less marble furniture, more wooden tree house. It was in a random survey of EAPS and Urban Planning courses and lectures my freshman year that I found myself unexpectedly and completely in love with cartography. And since the Institute had relatively few geography classes available to lower classmen, I had to teach myself. It had become my hobby. And while walking from the pathetic dinner alone, it occurred to me </w:t>
-      </w:r>
-      <w:r>
-        <w:lastRenderedPageBreak/>
-        <w:t xml:space="preserve">that this is exactly what </w:t>
+        <w:t>New Year’s Eve. 2009. Massachusetts Institute of Technology, aka MIT, aka the Institute. Eleven fifty-four pm. I met Nadine on the third-story entrance to a stairwell. She read me the time from her Casio watch, then told me to act quick, said I must find someone to kiss, or my year would just go off the rails. Two flights down, I kissed her at the landing. “That’s not what I meant,” she said before kissing me back and pushing my spine into the railing.</w:t>
+      </w:r>
+    </w:p>
+    <w:p>
+      <w:pPr>
+        <w:pStyle w:val="T"/>
+      </w:pPr>
+      <w:r>
+        <w:t>I felt certain I was hallucinating her. I had just smoked weed for the first time with a couple of rainbow-haired engineers in ill-fitting pants outside East Campus dormitory, so everything had a tinge of unreality. Besides she looked too much like me. Give me a few more years, longer hair, heavier thighs, let me loose on a bin of punk clothes and vintage watches, and I was kissing myself, hard, and uncomfortably. The hallucination bit my lip before she pulled away. “You should go outside,” she said, turning around to blink at me as she reached the bottom of the stairs. “Get some air. You look high.” She pushed on the tunnel door, and as it creaked open, I heard her talking to herself. "You are too new to want the world in a glass hat."</w:t>
+      </w:r>
+    </w:p>
+    <w:p>
+      <w:pPr>
+        <w:pStyle w:val="T"/>
+      </w:pPr>
+      <w:r>
+        <w:t xml:space="preserve">I wiped my mouth with the sleeve of my pink peacoat. A streak of blood provided counterpoint to the hallucination hypothesis. She could be real, I thought. I could be more aware than either of us realized. I opted to follow her into the tunnels, but when I opened the door, she wasn’t there. </w:t>
+      </w:r>
+      <w:r>
+        <w:rPr>
+          <w:i/>
+          <w:iCs/>
+        </w:rPr>
+        <w:t>Hello,</w:t>
+      </w:r>
+      <w:r>
+        <w:t xml:space="preserve"> I yelled. No one answered. I stared, waiting, at a red fire extinguisher hanging crooked in a fractal-cracked glass box.</w:t>
+      </w:r>
+    </w:p>
+    <w:p>
+      <w:pPr>
+        <w:pStyle w:val="T"/>
+      </w:pPr>
+      <w:r>
+        <w:t xml:space="preserve"> [[</w:t>
       </w:r>
       <w:proofErr w:type="spellStart"/>
       <w:proofErr w:type="gramStart"/>
       <w:r>
+        <w:t>img:fire</w:t>
+      </w:r>
+      <w:proofErr w:type="gramEnd"/>
+      <w:r>
+        <w:t>-extinguisher</w:t>
+      </w:r>
+      <w:proofErr w:type="spellEnd"/>
+      <w:r>
+        <w:t>]]</w:t>
+      </w:r>
+    </w:p>
+    <w:p>
+      <w:pPr>
+        <w:pStyle w:val="T1"/>
+      </w:pPr>
+      <w:r>
+        <w:lastRenderedPageBreak/>
+        <w:t xml:space="preserve">It had not been my intention to spend New Year’s Eve wandering alone through the Institute. Nine days earlier, my sister and I had arrived at my mother’s new ranch house in Albuquerque. We spent the week rushing to learn equestrian skills to teach our mother to train a rescue horse she had bought herself as a retirement gift. On the twenty-eighth, after four hours of cleaning the barn and walking the angry horse in circles, I boarded a flight to my hometown, Albany, and settled in for what I expected to be a week with my high school girlfriend. The plan was to recharge with </w:t>
+      </w:r>
+      <w:r>
+        <w:rPr>
+          <w:i/>
+          <w:iCs/>
+        </w:rPr>
+        <w:t>True Blood</w:t>
+      </w:r>
+      <w:r>
+        <w:t xml:space="preserve"> before Erin returned to Cooper Union, and I started a winter session research position taking care of rhesus macaques in a neurobiology lab. But the second night, I snuck into her room after her conservative parents fell asleep. I found her, hands in her Hello Kitty pajamas, some blurry dude half-naked on Skype, chanting her name. The next morning, I took a bus back to Cambridge and found myself alone in Simmons dormitory.</w:t>
+      </w:r>
+    </w:p>
+    <w:p>
+      <w:pPr>
+        <w:pStyle w:val="T"/>
+      </w:pPr>
+      <w:r>
+        <w:t>Simmons dormitory, aka the Sponge, was a cement grid designed by Steven Holl as a study of porousness and light. At the Institute, students were expected to live in a dormitory for the duration of their education, and incoming students typically picked a residence based on family-</w:t>
+      </w:r>
+      <w:proofErr w:type="spellStart"/>
+      <w:r>
+        <w:t>ish</w:t>
+      </w:r>
+      <w:proofErr w:type="spellEnd"/>
+      <w:r>
+        <w:t>, personality-defining subcultures. I picked the Sponge because Holl had designed custom furniture for it: Helsinki-style café tables in the dining room and staggered shelves mounted into lofts with sponge-themed ladders in the bedrooms.</w:t>
+      </w:r>
+    </w:p>
+    <w:p>
+      <w:pPr>
+        <w:pStyle w:val="T"/>
+      </w:pPr>
+      <w:r>
+        <w:t xml:space="preserve">In my single, there was a grid of nine square windows where campus lights bounced off falling snow and prismed against glass panes. Though I was alone on an industrial campus closed for holiday, for a while at least, I felt sophisticated, leaning back in </w:t>
+      </w:r>
+      <w:proofErr w:type="gramStart"/>
+      <w:r>
+        <w:t>a  site</w:t>
+      </w:r>
+      <w:proofErr w:type="gramEnd"/>
+      <w:r>
+        <w:t xml:space="preserve">-responsive, geometric chair. I spent the first four hours in that chair reading books and drinking black coffee. I spent the next twenty, elegantly dressed in silk purple pajamas, mourning Erin by watching illegally downloaded episodes of Sabrina the Teenage Witch and Buffy the Vampire Slayer, while eating </w:t>
+      </w:r>
+      <w:r>
+        <w:lastRenderedPageBreak/>
+        <w:t>a party-sized bag of Sour Patch Kids. The snow accumulated six inches on the windowsill, and by mid-day New Year’s Eve, I was equal parts nauseous and claustrophobic.</w:t>
+      </w:r>
+    </w:p>
+    <w:p>
+      <w:pPr>
+        <w:pStyle w:val="T"/>
+      </w:pPr>
+      <w:r>
+        <w:t>I forced myself to shower, dressed even more elegantly in a plaid wool dress, and trudged through fresh snow into Central Square. I ate dinner alone at four o’clock at my favorite Indian buffet, and by the time I paid the check, I felt just as sugary, twice as sick, and now also greasy and pathetic for being a college sophomore, in a huge city, alone on New Year’s Eve.</w:t>
+      </w:r>
+    </w:p>
+    <w:p>
+      <w:pPr>
+        <w:spacing w:line="240" w:lineRule="auto"/>
+      </w:pPr>
+      <w:r>
+        <w:t>[[~ice-of-</w:t>
+      </w:r>
+      <w:proofErr w:type="spellStart"/>
+      <w:r>
+        <w:t>boston</w:t>
+      </w:r>
+      <w:proofErr w:type="spellEnd"/>
+      <w:r>
+        <w:t xml:space="preserve">| the </w:t>
+      </w:r>
+      <w:proofErr w:type="gramStart"/>
+      <w:r>
+        <w:t>song ]</w:t>
+      </w:r>
+      <w:proofErr w:type="gramEnd"/>
+      <w:r>
+        <w:t>]</w:t>
+      </w:r>
+    </w:p>
+    <w:p>
+      <w:pPr>
+        <w:pStyle w:val="T"/>
+      </w:pPr>
+      <w:r>
+        <w:t>[[img:</w:t>
+      </w:r>
+      <w:r>
+        <w:t>simmons-snow-shift</w:t>
+      </w:r>
+      <w:r>
+        <w:t>]]</w:t>
+      </w:r>
+    </w:p>
+    <w:p>
+      <w:pPr>
+        <w:spacing w:line="240" w:lineRule="auto"/>
+      </w:pPr>
+    </w:p>
+    <w:p>
+      <w:pPr>
+        <w:pStyle w:val="T1"/>
+      </w:pPr>
+      <w:r>
+        <w:t xml:space="preserve">Until I came to MIT, everyone assumed I would be an architect. My father had been one after all, and I spent a lot of time near </w:t>
+      </w:r>
+      <w:r>
+        <w:t>buildings</w:t>
+      </w:r>
+      <w:r>
+        <w:t xml:space="preserve"> I thought he would like. Erin’s house, for example, had been built just before the turn of the century. Her parents had restored the façade while we were sophomores, and they let me help. I liked the built environment. But people undervalued the role my naturalist mother played, and that the same year my father died I adopted two cats. Or that I was raised in Albany where the most beautiful architecture, the Empire State Building, was designed explicitly to pave over poverty. A bunch of old Italian family homes had to be obliterated to make way for its fantastical towers and marble reflecting pools.</w:t>
+      </w:r>
+    </w:p>
+    <w:p>
+      <w:pPr>
+        <w:pStyle w:val="T"/>
+      </w:pPr>
+      <w:r>
+        <w:t xml:space="preserve">Whatever the reason, I wasn’t studying architecture. I was majoring in course 12, aka Earth, Atmosphere, and Planetary Sciences, aka EAPS, while also taking coursework to apply to be a vet. I pictured my future like Jane Goodall’s: equal part humans, animals, and environment, certain I would eventually build buildings but less marble furniture, more wooden tree house. It was in a random survey of EAPS and Urban Planning courses and lectures my freshman year that I found myself unexpectedly and completely in love with cartography. And since the Institute had relatively few geography classes available to lower classmen, I had to teach myself. </w:t>
+      </w:r>
+      <w:r>
+        <w:lastRenderedPageBreak/>
+        <w:t xml:space="preserve">It had become my hobby. And while walking from the pathetic dinner alone, it occurred to me that this is exactly what </w:t>
+      </w:r>
+      <w:proofErr w:type="spellStart"/>
+      <w:proofErr w:type="gramStart"/>
+      <w:r>
         <w:t>hobby’s</w:t>
       </w:r>
       <w:proofErr w:type="spellEnd"/>
@@ -185,11 +288,8 @@
         <w:pStyle w:val="T1"/>
       </w:pPr>
       <w:r>
-        <w:t xml:space="preserve">There were three kids smoking on the cement steps just outside of building 7. They offered me a couple sips of champagne, and if in exchange I would tell them about the maps I was holding. I </w:t>
-      </w:r>
-      <w:r>
         <w:lastRenderedPageBreak/>
-        <w:t>described Dymaxion Maps, and then after a few more sips, about my break-up. I have a song for you, they said, and switched a cassette in the hand-held Casio cassette player they were holding. The Dismemberment Plan, they said. Have you heard it. I hadn’t. … “All alone on Christmas …” That’s pathetic I said. Yeah, they agreed. So don’t worry about her, they said. Okay I agreed. Want to smoke they asked me, and sure I said. We</w:t>
+        <w:t>There were three kids smoking on the cement steps just outside of building 7. They offered me a couple sips of champagne, and if in exchange I would tell them about the maps I was holding. I described Dymaxion Maps, and then after a few more sips, about my break-up. I have a song for you, they said, and switched a cassette in the hand-held Casio cassette player they were holding. The Dismemberment Plan, they said. Have you heard it. I hadn’t. … “All alone on Christmas …” That’s pathetic I said. Yeah, they agreed. So don’t worry about her, they said. Okay I agreed. Want to smoke they asked me, and sure I said. We</w:t>
       </w:r>
     </w:p>
     <w:p>
@@ -309,21 +409,27 @@
         <w:rPr>
           <w:rFonts w:eastAsiaTheme="majorEastAsia"/>
         </w:rPr>
-        <w:t xml:space="preserve">. But there was no one, no one outside Simmons, no one inside it either. I imagined there was hardly anyone on campus tonight, except say a handful of security guards, or one or two truly committed researchers, fiddling over time sensitive experiments. </w:t>
-      </w:r>
-    </w:p>
-    <w:p>
-      <w:pPr>
-        <w:pStyle w:val="T"/>
+        <w:t xml:space="preserve">. But there was no one, no one outside Simmons, no one inside it either. I imagined there was hardly anyone </w:t>
+      </w:r>
+      <w:r>
         <w:rPr>
           <w:rFonts w:eastAsiaTheme="majorEastAsia"/>
         </w:rPr>
-      </w:pPr>
-      <w:r>
+        <w:lastRenderedPageBreak/>
+        <w:t xml:space="preserve">on campus tonight, except say a handful of security guards, or one or two truly committed researchers, fiddling over time sensitive experiments. </w:t>
+      </w:r>
+    </w:p>
+    <w:p>
+      <w:pPr>
+        <w:pStyle w:val="T"/>
         <w:rPr>
           <w:rFonts w:eastAsiaTheme="majorEastAsia"/>
         </w:rPr>
-        <w:lastRenderedPageBreak/>
+      </w:pPr>
+      <w:r>
+        <w:rPr>
+          <w:rFonts w:eastAsiaTheme="majorEastAsia"/>
+        </w:rPr>
         <w:t xml:space="preserve">The computer’s jingle alerted me that the download was complete. I slid the SD card out of the computer and popped it back in the Garmin. I opened ArcGIS, selected my files, and waited on the ceremony of conversion. I turned back to the wall of windows, held the warm mug of coffee in my cold hands and let the steam sting my eyes. The Dismemberment Plan sang, </w:t>
       </w:r>
       <w:r>
@@ -360,15 +466,18 @@
         <w:pStyle w:val="T1"/>
       </w:pPr>
       <w:r>
-        <w:t xml:space="preserve">To initiate making the map, whose true intention I felt certain would remain ambiguous until halfway through its creation, I typed up a procedure. At an Athena cluster, on a shared computer off the Infinite Hallway in the main building of campus, I made a list of the twelve most iconic architectural spaces at the Institute then googled historical anecdotes to document about each place. These microhistories would serve as descriptions to each waypoint, creating a simple walking tour of the Institute. </w:t>
-      </w:r>
-    </w:p>
-    <w:p>
-      <w:pPr>
-        <w:pStyle w:val="T"/>
-      </w:pPr>
+        <w:t xml:space="preserve">To initiate making the map, whose true intention I felt certain would remain ambiguous until halfway through its creation, I typed up a procedure. At an Athena cluster, on a shared computer off the Infinite Hallway in the main building of campus, I made a list of the twelve most iconic architectural spaces at the Institute then googled historical anecdotes to document about each </w:t>
+      </w:r>
       <w:r>
         <w:lastRenderedPageBreak/>
+        <w:t xml:space="preserve">place. These microhistories would serve as descriptions to each waypoint, creating a simple walking tour of the Institute. </w:t>
+      </w:r>
+    </w:p>
+    <w:p>
+      <w:pPr>
+        <w:pStyle w:val="T"/>
+      </w:pPr>
+      <w:r>
         <w:t>From the Athena cluster, I made my way through the hallway and up xx flights of stairs to my first waypoint, Barker Reading Room, the cozy library inside the Institute’s main dome. It was a spherical room enclosed by white columns and windows with curlicues of wood carving oversetting the glass, lots of circular carpets, rings of rounded green sofas, and wooden tables. To make the waypoint, ceremoniously, I walked to the very center of the ancient room and held the Garmin above my chest. I looked up, imagining a perfect line between my spine, my eyes, and the eye of the dome, concentric circles of limestone with inset windows, meeting at the small plastic sheet, and pressed MARK.</w:t>
       </w:r>
     </w:p>
@@ -413,6 +522,7 @@
         <w:pStyle w:val="T"/>
       </w:pPr>
       <w:r>
+        <w:lastRenderedPageBreak/>
         <w:t xml:space="preserve">Ian McHarg first proposed the layering approach in </w:t>
       </w:r>
       <w:r>
@@ -450,75 +560,65 @@
         <w:t>against</w:t>
       </w:r>
       <w:r>
-        <w:t xml:space="preserve">, nature. Ian had grown up traveling between Glasgow and the surrounding countryside. He loved the </w:t>
-      </w:r>
+        <w:t>, nature. Ian had grown up traveling between Glasgow and the surrounding countryside. He loved the countryside and wished the city had been built continuous with it. In the seventies, his book became zeitgeist. Developers began seeking harmony with the existing order—plants, people, infrastructure—both in the countryside and the city.</w:t>
+      </w:r>
+    </w:p>
+    <w:p>
+      <w:pPr>
+        <w:pStyle w:val="T"/>
+      </w:pPr>
+      <w:r>
+        <w:t xml:space="preserve">When William J. Bosworth designed the Institute’s Cambridge campus, just before WWII, and long before the layer-cake method had been proposed, he intuitively designed in relationship to the city and the school’s function. The three-armed E-shape of the main campus was intended to create cohesion between disparate departments. Rather than segmenting research areas in various standalone structures, they wanted the people of each department to wander the same hallways, encouraging random encounters and collaboration. Each building in the original building was a three-story rectangle stacked beside other three-story rectangles to form an E opening to the Charles River. Responsive to climate, Bosworth ensured that once a researcher walked inside the building, they never really needed to step out. Tracing the E and associated buildings was an underground network of tunnels. </w:t>
+      </w:r>
+    </w:p>
+    <w:p>
+      <w:pPr>
+        <w:pStyle w:val="T"/>
+      </w:pPr>
+      <w:r>
+        <w:t>Recent architects who have contributed to the blueprint of the school more intentionally follow McHarg’s practices. They survey and layer the history of the existing Institute buildings, as well as the factories that predate it, to situate their additions seamlessly into the patchwork. It was easy when researching contemporary Institute building to find the explicit architect’s statement defining how each building sits in relationship to its surroundings. For example, the architects of Simmons wrote in detail about how the sponge-like building arose from detailed maps of the factories that once lined West Campus and patterns of light over the course of a year.</w:t>
+      </w:r>
+    </w:p>
+    <w:p>
+      <w:pPr>
+        <w:pStyle w:val="T"/>
+      </w:pPr>
       <w:r>
         <w:lastRenderedPageBreak/>
-        <w:t>countryside and wished the city had been built continuous with it. In the seventies, his book became zeitgeist. Developers began seeking harmony with the existing order—plants, people, infrastructure—both in the countryside and the city.</w:t>
-      </w:r>
-    </w:p>
-    <w:p>
-      <w:pPr>
-        <w:pStyle w:val="T"/>
-      </w:pPr>
-      <w:r>
-        <w:t xml:space="preserve">When William J. Bosworth designed the Institute’s Cambridge campus, just before WWII, and long before the layer-cake method had been proposed, he intuitively designed in relationship to the city and the school’s function. The three-armed E-shape of the main campus was intended to create cohesion between disparate departments. Rather than segmenting research areas in various standalone structures, they wanted the people of each department to wander the same hallways, encouraging random encounters and collaboration. Each building in the original building was a three-story rectangle stacked beside other three-story rectangles to form an E opening to the Charles River. Responsive to climate, Bosworth ensured that once a researcher walked inside the building, they never really needed to step out. Tracing the E and associated buildings was an underground network of tunnels. </w:t>
-      </w:r>
-    </w:p>
-    <w:p>
-      <w:pPr>
-        <w:pStyle w:val="T"/>
-      </w:pPr>
-      <w:r>
-        <w:t>Recent architects who have contributed to the blueprint of the school more intentionally follow McHarg’s practices. They survey and layer the history of the existing Institute buildings, as well as the factories that predate it, to situate their additions seamlessly into the patchwork. It was easy when researching contemporary Institute building to find the explicit architect’s statement defining how each building sits in relationship to its surroundings. For example, the architects of Simmons wrote in detail about how the sponge-like building arose from detailed maps of the factories that once lined West Campus and patterns of light over the course of a year.</w:t>
-      </w:r>
-    </w:p>
-    <w:p>
-      <w:pPr>
-        <w:pStyle w:val="T"/>
-      </w:pPr>
-      <w:r>
-        <w:t xml:space="preserve">I thought about layering as I made the first waypoints, an idea forming that historically significant architectural spaces could represent a single layer of the map, but the final map of the Institute’s history would have many layers. As I moved about campus marking points, the layers </w:t>
-      </w:r>
+        <w:t>I thought about layering as I made the first waypoints, an idea forming that historically significant architectural spaces could represent a single layer of the map, but the final map of the Institute’s history would have many layers. As I moved about campus marking points, the layers appeared to me like visions projecting out of the marble floors: There were histories of equity, discovery, displacement, and war coursing through this place, just waiting to be woven together.</w:t>
+      </w:r>
+    </w:p>
+    <w:p>
+      <w:pPr>
+        <w:pStyle w:val="T"/>
+      </w:pPr>
+      <w:r>
+        <w:t xml:space="preserve">Between midnight and three am, I encountered seven people, including one security guard half-asleep on a bench in one of the tunnels. The absence of people made it easier to see the history in the buildings. There were no distractions, simply the buildings, their architectural details and intricacies, their scuffs and imperfections rising like voices or ghosts. </w:t>
+      </w:r>
+    </w:p>
+    <w:p>
+      <w:pPr>
+        <w:pStyle w:val="T1"/>
+      </w:pPr>
+      <w:r>
+        <w:t xml:space="preserve">At three thirty, I bought a vending machine pop-tart and ate in the Athena computer cluster in building 10, the main lobby underneath Barker Library, while researching old maps of the Institute. MIT Museum’s archive had digitized versions of the blueprints and renderings of all the proposals William Welles Bosworth made before settling on the final design. I printed out a handful of the unrealized plans on tabloid paper, as well as the realized original campus map. While I stood by the printer, three kids in poorly fitting dark denim and ragged army-fatigue coats walked past the glass walls, carrying a Rubbermaid that looked to be filled with wires. All three had colorful dyed hair and at least one facial piercing. </w:t>
+      </w:r>
+    </w:p>
+    <w:p>
+      <w:pPr>
+        <w:pStyle w:val="T"/>
+      </w:pPr>
+      <w:r>
+        <w:t xml:space="preserve">Bosworth had originally designed campus in relationship to the city of Boston, with the main entrance, building 10, facing the Chales River. Shortly after completing this blueprint, it became clear there needed to be an opening towards Mass Ave, as students and faculty would more often arrive by road or foot, not via boat. He designed a second dome and lobby opening towards Cambridge, building 7. Just as he had done with the original entrance, he surrounded the entrance with columns and limestone steps. </w:t>
+      </w:r>
+    </w:p>
+    <w:p>
+      <w:pPr>
+        <w:pStyle w:val="T"/>
+      </w:pPr>
       <w:r>
         <w:lastRenderedPageBreak/>
-        <w:t>appeared to me like visions projecting out of the marble floors: There were histories of equity, discovery, displacement, and war coursing through this place, just waiting to be woven together.</w:t>
-      </w:r>
-    </w:p>
-    <w:p>
-      <w:pPr>
-        <w:pStyle w:val="T"/>
-      </w:pPr>
-      <w:r>
-        <w:t xml:space="preserve">Between midnight and three am, I encountered seven people, including one security guard half-asleep on a bench in one of the tunnels. The absence of people made it easier to see the history in the buildings. There were no distractions, simply the buildings, their architectural details and intricacies, their scuffs and imperfections rising like voices or ghosts. </w:t>
-      </w:r>
-    </w:p>
-    <w:p>
-      <w:pPr>
-        <w:pStyle w:val="T1"/>
-      </w:pPr>
-      <w:r>
-        <w:t xml:space="preserve">At three thirty, I bought a vending machine pop-tart and ate in the Athena computer cluster in building 10, the main lobby underneath Barker Library, while researching old maps of the Institute. MIT Museum’s archive had digitized versions of the blueprints and renderings of all the proposals William Welles Bosworth made before settling on the final design. I printed out a handful of the unrealized plans on tabloid paper, as well as the realized original campus map. While I stood by the printer, three kids in poorly fitting dark denim and ragged army-fatigue coats walked past the glass walls, carrying a Rubbermaid that looked to be filled with wires. All three had colorful dyed hair and at least one facial piercing. </w:t>
-      </w:r>
-    </w:p>
-    <w:p>
-      <w:pPr>
-        <w:pStyle w:val="T"/>
-      </w:pPr>
-      <w:r>
-        <w:t xml:space="preserve">Bosworth had originally designed campus in relationship to the city of Boston, with the main entrance, building 10, facing the Chales River. Shortly after completing this blueprint, it became clear there needed to be an opening towards Mass Ave, as students and faculty would more often arrive by road or foot, not via boat. He designed a second dome and lobby opening towards Cambridge, building 7. Just as he had done with the original entrance, he surrounded the entrance with columns and limestone steps. </w:t>
-      </w:r>
-    </w:p>
-    <w:p>
-      <w:pPr>
-        <w:pStyle w:val="T"/>
-      </w:pPr>
-      <w:r>
-        <w:t xml:space="preserve">Inside the lobby of building 7, the walls were honey white with green oxidized windows and doors leading to six hallways. Three floored ceiling opening to the dome, which unlike </w:t>
-      </w:r>
-      <w:r>
-        <w:lastRenderedPageBreak/>
-        <w:t xml:space="preserve">building 32 had a glass ceiling looking out at the sky. On the second and third floors of the building, open balconies with ornate metal banisters looked down at the lobby. </w:t>
+        <w:t xml:space="preserve">Inside the lobby of building 7, the walls were honey white with green oxidized windows and doors leading to six hallways. Three floored ceiling opening to the dome, which unlike building 32 had a glass ceiling looking out at the sky. On the second and third floors of the building, open balconies with ornate metal banisters looked down at the lobby. </w:t>
       </w:r>
     </w:p>
     <w:p>
@@ -554,11 +654,11 @@
         </w:rPr>
       </w:pPr>
       <w:r>
-        <w:t xml:space="preserve">I felt Erin’s hand on my arm, turned to see her sitting on the pillar beside me, taking colored pencils out of the fanny pack. She picked up the original campus map and drew an elephant in one room, a giraffe in another, a monkey in a third. “It’s a zoo,” she said, laughing. Her laugh reverberating, chasing the lingering echo of the punks. “What are you doing here,” she asked. “Why are we doing this?” She laughed again, and the veneer broke. I looked up at the dome, then back where she had been sitting, but she wasn’t there anymore, and there were no </w:t>
+        <w:t xml:space="preserve">I felt Erin’s hand on my arm, turned to see her sitting on the pillar beside me, taking colored pencils out of the fanny pack. She picked up the original campus map and drew an elephant in one room, a giraffe in another, a monkey in a third. “It’s a zoo,” she said, laughing. Her laugh reverberating, chasing the lingering echo of the punks. “What are you doing here,” she </w:t>
       </w:r>
       <w:r>
         <w:lastRenderedPageBreak/>
-        <w:t xml:space="preserve">animals on the campus map, it just lay flat and bare on the pillar. </w:t>
+        <w:t xml:space="preserve">asked. “Why are we doing this?” She laughed again, and the veneer broke. I looked up at the dome, then back where she had been sitting, but she wasn’t there anymore, and there were no animals on the campus map, it just lay flat and bare on the pillar. </w:t>
       </w:r>
       <w:r>
         <w:rPr>
@@ -607,15 +707,18 @@
         <w:pStyle w:val="T"/>
       </w:pPr>
       <w:r>
-        <w:t xml:space="preserve">Buildings 66 and 52 were connected to one another via extensions of Bosworth’s original tunnel system. As the wind and snow were crashing hard now, I made my way through the infinite to building 66 and entered the tunnels rather than crossing the wind-tunnel of the main corridor that separated building 52 and the main campus. </w:t>
-      </w:r>
-    </w:p>
-    <w:p>
-      <w:pPr>
-        <w:pStyle w:val="T"/>
-      </w:pPr>
+        <w:t xml:space="preserve">Buildings 66 and 52 were connected to one another via extensions of Bosworth’s original tunnel system. As the wind and snow were crashing hard now, I made my way through the </w:t>
+      </w:r>
       <w:r>
         <w:lastRenderedPageBreak/>
+        <w:t xml:space="preserve">infinite to building 66 and entered the tunnels rather than crossing the wind-tunnel of the main corridor that separated building 52 and the main campus. </w:t>
+      </w:r>
+    </w:p>
+    <w:p>
+      <w:pPr>
+        <w:pStyle w:val="T"/>
+      </w:pPr>
+      <w:r>
         <w:t xml:space="preserve">Most of the Institute’s tunnels felt like the main floor, albeit with a foot long stack of exposed pipes, worse tile, and fewer windows. Other parts, like 66, felt less finished and damp with unpainted plaster white walls, water stains, and low ceilings. I had never experienced any uneasy walking through campus, but the lights in the basement of 66 were only half on that night, and for the first time I felt creeped out, like something malevolent could take place in the building that had always only felt safe to me. Water dripped from the ceiling in a dark part of the hallway, and I could hear rats scurrying across the pipes. I walked fast, hoping to make it through the darkness into familiar parts of the tunnel under the infinite before a small creature emerged with sharp fangs, when I </w:t>
       </w:r>
       <w:proofErr w:type="spellStart"/>
@@ -650,15 +753,18 @@
         <w:pStyle w:val="T"/>
       </w:pPr>
       <w:r>
-        <w:t>I was kneeling and taking notes on a data point I had just made for a pile of ancient and yellowed dot matrix printers, when voices rounded one of the building’s three sixty-degree angled corners. By instinct, I stood up, grabbed the handle to the closest door and slipped inside what turned out to be a janitor’s closet, half empty, half filled with mops and spray bottles.</w:t>
-      </w:r>
-    </w:p>
-    <w:p>
-      <w:pPr>
-        <w:pStyle w:val="T"/>
-      </w:pPr>
+        <w:t xml:space="preserve">I was kneeling and taking notes on a data point I had just made for a pile of ancient and yellowed dot matrix printers, when voices rounded one of the building’s three sixty-degree </w:t>
+      </w:r>
       <w:r>
         <w:lastRenderedPageBreak/>
+        <w:t>angled corners. By instinct, I stood up, grabbed the handle to the closest door and slipped inside what turned out to be a janitor’s closet, half empty, half filled with mops and spray bottles.</w:t>
+      </w:r>
+    </w:p>
+    <w:p>
+      <w:pPr>
+        <w:pStyle w:val="T"/>
+      </w:pPr>
+      <w:r>
         <w:t xml:space="preserve">The voices were also interested in the printers and stopped right outside the closet. I inhaled to subdue a mild claustrophobic panic and sat down on the floor to listen and wait them out. It took me a minute to adjust to the cadence of their dialogue and slightly muffled voices through the thick wooden door, but by the time I could make out what they were saying, they were focused in on the details of the printers’ parts. </w:t>
       </w:r>
     </w:p>
@@ -683,15 +789,18 @@
       </w:r>
       <w:proofErr w:type="gramEnd"/>
       <w:r>
-        <w:t xml:space="preserve"> they also make good sounds, there could be an installation or performance if someone thought through it properly. Ghost voices erased from the ledger servers make. At this, the voices started saying goodbye and dispersed, some of them saying they would get the carts and return, some of them saying they were going to bed.</w:t>
-      </w:r>
-    </w:p>
-    <w:p>
-      <w:pPr>
-        <w:pStyle w:val="T"/>
-      </w:pPr>
+        <w:t xml:space="preserve"> they also make good sounds, there could be an installation or performance if someone thought through it properly. Ghost voices erased from the ledger </w:t>
+      </w:r>
       <w:r>
         <w:lastRenderedPageBreak/>
+        <w:t>servers make. At this, the voices started saying goodbye and dispersed, some of them saying they would get the carts and return, some of them saying they were going to bed.</w:t>
+      </w:r>
+    </w:p>
+    <w:p>
+      <w:pPr>
+        <w:pStyle w:val="T"/>
+      </w:pPr>
+      <w:r>
         <w:t xml:space="preserve">  I sat in the closet for a while after the voices had left, less because of any lingering nervousness, and more because of inertia. Sitting woke up a deep exhaustion. Just after five that morning, I had woken up in Erin’s guest bedroom. It was now nearly three am and I was still awake. The cold tile and bucket ambience was more comfortable than it should be, and the only thing that got me to stand was the knowledge that at least two voices would shortly be returning with carts. </w:t>
       </w:r>
     </w:p>
@@ -710,15 +819,7 @@
         <w:t>Sport Death</w:t>
       </w:r>
       <w:r>
-        <w:t xml:space="preserve"> emblem, a smiling skull with a </w:t>
-      </w:r>
-      <w:proofErr w:type="gramStart"/>
-      <w:r>
-        <w:t>three star</w:t>
-      </w:r>
-      <w:proofErr w:type="gramEnd"/>
-      <w:r>
-        <w:t xml:space="preserve">, eleven stripe American flag. She wasn’t wearing any </w:t>
+        <w:t xml:space="preserve"> emblem, a smiling skull with a three star, eleven stripe American flag. She wasn’t wearing any </w:t>
       </w:r>
       <w:proofErr w:type="gramStart"/>
       <w:r>
@@ -833,7 +934,7 @@
 </file>
 
 <file path=word/numbering.xml><?xml version="1.0" encoding="utf-8"?>
-<w:numbering xmlns:wpc="http://schemas.microsoft.com/office/word/2010/wordprocessingCanvas" xmlns:cx="http://schemas.microsoft.com/office/drawing/2014/chartex" xmlns:cx1="http://schemas.microsoft.com/office/drawing/2015/9/8/chartex" xmlns:cx2="http://schemas.microsoft.com/office/drawing/2015/10/21/chartex" xmlns:cx3="http://schemas.microsoft.com/office/drawing/2016/5/9/chartex" xmlns:cx4="http://schemas.microsoft.com/office/drawing/2016/5/10/chartex" xmlns:cx5="http://schemas.microsoft.com/office/drawing/2016/5/11/chartex" xmlns:cx6="http://schemas.microsoft.com/office/drawing/2016/5/12/chartex" xmlns:cx7="http://schemas.microsoft.com/office/drawing/2016/5/13/chartex" xmlns:cx8="http://schemas.microsoft.com/office/drawing/2016/5/14/chartex" xmlns:mc="http://schemas.openxmlformats.org/markup-compatibility/2006" xmlns:aink="http://schemas.microsoft.com/office/drawing/2016/ink" xmlns:am3d="http://schemas.microsoft.com/office/drawing/2017/model3d" xmlns:o="urn:schemas-microsoft-com:office:office" xmlns:oel="http://schemas.microsoft.com/office/2019/extlst" xmlns:r="http://schemas.openxmlformats.org/officeDocument/2006/relationships" xmlns:m="http://schemas.openxmlformats.org/officeDocument/2006/math" xmlns:v="urn:schemas-microsoft-com:vml" xmlns:wp14="http://schemas.microsoft.com/office/word/2010/wordprocessingDrawing" xmlns:wp="http://schemas.openxmlformats.org/drawingml/2006/wordprocessingDrawing" xmlns:w10="urn:schemas-microsoft-com:office:word" xmlns:w="http://schemas.openxmlformats.org/wordprocessingml/2006/main" xmlns:w14="http://schemas.microsoft.com/office/word/2010/wordml" xmlns:w15="http://schemas.microsoft.com/office/word/2012/wordml" xmlns:w16cex="http://schemas.microsoft.com/office/word/2018/wordml/cex" xmlns:w16cid="http://schemas.microsoft.com/office/word/2016/wordml/cid" xmlns:w16="http://schemas.microsoft.com/office/word/2018/wordml" xmlns:w16du="http://schemas.microsoft.com/office/word/2023/wordml/word16du" xmlns:w16sdtdh="http://schemas.microsoft.com/office/word/2020/wordml/sdtdatahash" xmlns:w16sdtfl="http://schemas.microsoft.com/office/word/2024/wordml/sdtformatlock" xmlns:w16se="http://schemas.microsoft.com/office/word/2015/wordml/symex" xmlns:wpg="http://schemas.microsoft.com/office/word/2010/wordprocessingGroup" xmlns:wpi="http://schemas.microsoft.com/office/word/2010/wordprocessingInk" xmlns:wne="http://schemas.microsoft.com/office/word/2006/wordml" xmlns:wps="http://schemas.microsoft.com/office/word/2010/wordprocessingShape" mc:Ignorable="w14 w15 w16se w16cid w16 w16cex w16sdtdh w16sdtfl w16du wp14">
+<w:numbering xmlns:wpc="http://schemas.microsoft.com/office/word/2010/wordprocessingCanvas" xmlns:cx="http://schemas.microsoft.com/office/drawing/2014/chartex" xmlns:cx1="http://schemas.microsoft.com/office/drawing/2015/9/8/chartex" xmlns:cx2="http://schemas.microsoft.com/office/drawing/2015/10/21/chartex" xmlns:cx3="http://schemas.microsoft.com/office/drawing/2016/5/9/chartex" xmlns:cx4="http://schemas.microsoft.com/office/drawing/2016/5/10/chartex" xmlns:cx5="http://schemas.microsoft.com/office/drawing/2016/5/11/chartex" xmlns:cx6="http://schemas.microsoft.com/office/drawing/2016/5/12/chartex" xmlns:cx7="http://schemas.microsoft.com/office/drawing/2016/5/13/chartex" xmlns:cx8="http://schemas.microsoft.com/office/drawing/2016/5/14/chartex" xmlns:mc="http://schemas.openxmlformats.org/markup-compatibility/2006" xmlns:m="http://schemas.openxmlformats.org/officeDocument/2006/math" xmlns:aink="http://schemas.microsoft.com/office/drawing/2016/ink" xmlns:am3d="http://schemas.microsoft.com/office/drawing/2017/model3d" xmlns:oel="http://schemas.microsoft.com/office/2019/extlst" xmlns:r="http://schemas.openxmlformats.org/officeDocument/2006/relationships" xmlns:wp14="http://schemas.microsoft.com/office/word/2010/wordprocessingDrawing" xmlns:wp="http://schemas.openxmlformats.org/drawingml/2006/wordprocessingDrawing" xmlns:wpg="http://schemas.microsoft.com/office/word/2010/wordprocessingGroup" xmlns:wpi="http://schemas.microsoft.com/office/word/2010/wordprocessingInk" xmlns:wps="http://schemas.microsoft.com/office/word/2010/wordprocessingShape" xmlns:o="urn:schemas-microsoft-com:office:office" xmlns:v="urn:schemas-microsoft-com:vml" xmlns:w10="urn:schemas-microsoft-com:office:word" xmlns:w="http://schemas.openxmlformats.org/wordprocessingml/2006/main" xmlns:w14="http://schemas.microsoft.com/office/word/2010/wordml" xmlns:w15="http://schemas.microsoft.com/office/word/2012/wordml" xmlns:w16cex="http://schemas.microsoft.com/office/word/2018/wordml/cex" xmlns:w16cid="http://schemas.microsoft.com/office/word/2016/wordml/cid" xmlns:w16="http://schemas.microsoft.com/office/word/2018/wordml" xmlns:w16sdtdh="http://schemas.microsoft.com/office/word/2020/wordml/sdtdatahash" xmlns:w16sdtfl="http://schemas.microsoft.com/office/word/2024/wordml/sdtformatlock" xmlns:w16se="http://schemas.microsoft.com/office/word/2015/wordml/symex" xmlns:w16du="http://schemas.microsoft.com/office/word/2023/wordml/word16du" xmlns:wne="http://schemas.microsoft.com/office/word/2006/wordml" mc:Ignorable="w14 w15 w16se w16cid w16 w16cex w16sdtdh w16sdtfl w16du wp14">
   <w:abstractNum w:abstractNumId="0" w15:restartNumberingAfterBreak="0">
     <w:nsid w:val="4E40385C"/>
     <w:multiLevelType w:val="hybridMultilevel"/>
@@ -930,7 +1031,7 @@
 </file>
 
 <file path=word/styles.xml><?xml version="1.0" encoding="utf-8"?>
-<w:styles xmlns:mc="http://schemas.openxmlformats.org/markup-compatibility/2006" xmlns:r="http://schemas.openxmlformats.org/officeDocument/2006/relationships" xmlns:w="http://schemas.openxmlformats.org/wordprocessingml/2006/main" xmlns:w14="http://schemas.microsoft.com/office/word/2010/wordml" xmlns:w15="http://schemas.microsoft.com/office/word/2012/wordml" xmlns:w16cex="http://schemas.microsoft.com/office/word/2018/wordml/cex" xmlns:w16cid="http://schemas.microsoft.com/office/word/2016/wordml/cid" xmlns:w16="http://schemas.microsoft.com/office/word/2018/wordml" xmlns:w16du="http://schemas.microsoft.com/office/word/2023/wordml/word16du" xmlns:w16sdtdh="http://schemas.microsoft.com/office/word/2020/wordml/sdtdatahash" xmlns:w16sdtfl="http://schemas.microsoft.com/office/word/2024/wordml/sdtformatlock" xmlns:w16se="http://schemas.microsoft.com/office/word/2015/wordml/symex" mc:Ignorable="w14 w15 w16se w16cid w16 w16cex w16sdtdh w16sdtfl w16du">
+<w:styles xmlns:mc="http://schemas.openxmlformats.org/markup-compatibility/2006" xmlns:r="http://schemas.openxmlformats.org/officeDocument/2006/relationships" xmlns:w="http://schemas.openxmlformats.org/wordprocessingml/2006/main" xmlns:w14="http://schemas.microsoft.com/office/word/2010/wordml" xmlns:w15="http://schemas.microsoft.com/office/word/2012/wordml" xmlns:w16cex="http://schemas.microsoft.com/office/word/2018/wordml/cex" xmlns:w16cid="http://schemas.microsoft.com/office/word/2016/wordml/cid" xmlns:w16="http://schemas.microsoft.com/office/word/2018/wordml" xmlns:w16sdtdh="http://schemas.microsoft.com/office/word/2020/wordml/sdtdatahash" xmlns:w16sdtfl="http://schemas.microsoft.com/office/word/2024/wordml/sdtformatlock" xmlns:w16se="http://schemas.microsoft.com/office/word/2015/wordml/symex" xmlns:w16du="http://schemas.microsoft.com/office/word/2023/wordml/word16du" mc:Ignorable="w14 w15 w16se w16cid w16 w16cex w16sdtdh w16sdtfl w16du">
   <w:docDefaults>
     <w:rPrDefault>
       <w:rPr>
@@ -1870,6 +1971,17 @@
       <w:spacing w:before="240"/>
     </w:pPr>
   </w:style>
+  <w:style w:type="paragraph" w:styleId="NormalWeb">
+    <w:name w:val="Normal (Web)"/>
+    <w:basedOn w:val="Normal"/>
+    <w:uiPriority w:val="99"/>
+    <w:semiHidden/>
+    <w:unhideWhenUsed/>
+    <w:rsid w:val="00C757F2"/>
+    <w:pPr>
+      <w:spacing w:before="100" w:beforeAutospacing="1" w:after="100" w:afterAutospacing="1" w:line="240" w:lineRule="auto"/>
+    </w:pPr>
+  </w:style>
 </w:styles>
 </file>
 

</xml_diff>